<commit_message>
Add requirement-driven product development with isolated acceptance and versioned delivery
</commit_message>
<xml_diff>
--- a/multi-agent-training/培训讲义.docx
+++ b/multi-agent-training/培训讲义.docx
@@ -378,20 +378,20 @@
               <w:pStyle w:val="TableText"/>
             </w:pPr>
             <w:r>
-              <w:t xml:space="preserve">15分钟</w:t>
-            </w:r>
-          </w:p>
-        </w:tc>
-        <w:tc>
-          <w:tcPr>
-            <w:tcW w:w="1667" w:type="pct"/>
-          </w:tcPr>
-          <w:p>
-            <w:pPr>
-              <w:pStyle w:val="TableText"/>
-            </w:pPr>
-            <w:r>
-              <w:t xml:space="preserve">一份报告及运行记录</w:t>
+              <w:t xml:space="preserve">课后独立完成</w:t>
+            </w:r>
+          </w:p>
+        </w:tc>
+        <w:tc>
+          <w:tcPr>
+            <w:tcW w:w="1667" w:type="pct"/>
+          </w:tcPr>
+          <w:p>
+            <w:pPr>
+              <w:pStyle w:val="TableText"/>
+            </w:pPr>
+            <w:r>
+              <w:t xml:space="preserve">两个领域的源码、隔离验收、批准与交付证据</w:t>
             </w:r>
           </w:p>
         </w:tc>
@@ -726,7 +726,7 @@
         <w:pStyle w:val="Normal"/>
       </w:pPr>
       <w:r>
-        <w:t xml:space="preserve">本机已运行离线控制流并通过自动检查。当前Python入口无法启动，网络也无法下载依赖；真实API与Python框架实验尚未验证。查看 验证报告.md 获取具体范围。</w:t>
+        <w:t xml:space="preserve">本机 Python 环境已可用。2026-10-10 审查已构建原六个 LangGraph 入口、构造 AutoGen，并实际执行 MCP 本地协议调用；Supervisor 有历史真实模型记录。构图不能代表业务验收。开发团队现使用相邻 agent-training 的统一 MetaGPT 产品链路，验证范围见 验证报告.md。</w:t>
       </w:r>
     </w:p>
     <w:p>
@@ -1664,7 +1664,7 @@
         <w:pStyle w:val="Normal"/>
       </w:pPr>
       <w:r>
-        <w:t xml:space="preserve">本实验产出教学方案。code_tool返回固定代码样例，design_tool返回教学模板，QA的工具只检查语法；它们不代表自动开发了一个网站。</w:t>
+        <w:t xml:space="preserve">本实验产出教学方案。技术与设计团队使用design_tool讨论设计，QA评审测试计划；本图不写源码或执行业务测试。需要实际产品实现时使用第7章的devteam入口。</w:t>
       </w:r>
     </w:p>
     <w:p>
@@ -2219,33 +2219,33 @@
               <w:pStyle w:val="TableText"/>
             </w:pPr>
             <w:r>
-              <w:t xml:space="preserve">spec</w:t>
-            </w:r>
-          </w:p>
-        </w:tc>
-        <w:tc>
-          <w:tcPr>
-            <w:tcW w:w="1250" w:type="pct"/>
-          </w:tcPr>
-          <w:p>
-            <w:pPr>
-              <w:pStyle w:val="TableText"/>
-            </w:pPr>
-            <w:r>
-              <w:t xml:space="preserve">返回固定的待办事项函数样例</w:t>
-            </w:r>
-          </w:p>
-        </w:tc>
-        <w:tc>
-          <w:tcPr>
-            <w:tcW w:w="1250" w:type="pct"/>
-          </w:tcPr>
-          <w:p>
-            <w:pPr>
-              <w:pStyle w:val="TableText"/>
-            </w:pPr>
-            <w:r>
-              <w:t xml:space="preserve">不是动态生成完整应用</w:t>
+              <w:t xml:space="preserve">多文件bundle JSON</w:t>
+            </w:r>
+          </w:p>
+        </w:tc>
+        <w:tc>
+          <w:tcPr>
+            <w:tcW w:w="1250" w:type="pct"/>
+          </w:tcPr>
+          <w:p>
+            <w:pPr>
+              <w:pStyle w:val="TableText"/>
+            </w:pPr>
+            <w:r>
+              <w:t xml:space="preserve">实际写入宿主指定的产品目录</w:t>
+            </w:r>
+          </w:p>
+        </w:tc>
+        <w:tc>
+          <w:tcPr>
+            <w:tcW w:w="1250" w:type="pct"/>
+          </w:tcPr>
+          <w:p>
+            <w:pPr>
+              <w:pStyle w:val="TableText"/>
+            </w:pPr>
+            <w:r>
+              <w:t xml:space="preserve">需要已确认的product.json；不自动审批</w:t>
             </w:r>
           </w:p>
         </w:tc>
@@ -2273,33 +2273,33 @@
               <w:pStyle w:val="TableText"/>
             </w:pPr>
             <w:r>
-              <w:t xml:space="preserve">code</w:t>
-            </w:r>
-          </w:p>
-        </w:tc>
-        <w:tc>
-          <w:tcPr>
-            <w:tcW w:w="1250" w:type="pct"/>
-          </w:tcPr>
-          <w:p>
-            <w:pPr>
-              <w:pStyle w:val="TableText"/>
-            </w:pPr>
-            <w:r>
-              <w:t xml:space="preserve">使用ast.parse检查Python语法</w:t>
-            </w:r>
-          </w:p>
-        </w:tc>
-        <w:tc>
-          <w:tcPr>
-            <w:tcW w:w="1250" w:type="pct"/>
-          </w:tcPr>
-          <w:p>
-            <w:pPr>
-              <w:pStyle w:val="TableText"/>
-            </w:pPr>
-            <w:r>
-              <w:t xml:space="preserve">不执行代码、不运行单元测试</w:t>
+              <w:t xml:space="preserve">宿主选定的工作区</w:t>
+            </w:r>
+          </w:p>
+        </w:tc>
+        <w:tc>
+          <w:tcPr>
+            <w:tcW w:w="1250" w:type="pct"/>
+          </w:tcPr>
+          <w:p>
+            <w:pPr>
+              <w:pStyle w:val="TableText"/>
+            </w:pPr>
+            <w:r>
+              <w:t xml:space="preserve">Docker隔离运行，外部HTTP与浏览器业务验收</w:t>
+            </w:r>
+          </w:p>
+        </w:tc>
+        <w:tc>
+          <w:tcPr>
+            <w:tcW w:w="1250" w:type="pct"/>
+          </w:tcPr>
+          <w:p>
+            <w:pPr>
+              <w:pStyle w:val="TableText"/>
+            </w:pPr>
+            <w:r>
+              <w:t xml:space="preserve">Docker不可用直接失败</w:t>
             </w:r>
           </w:p>
         </w:tc>
@@ -2318,7 +2318,7 @@
         <w:pStyle w:val="Normal"/>
       </w:pPr>
       <w:r>
-        <w:t xml:space="preserve">练习：给test_tool一个语法正确但业务逻辑错误的函数，解释为什么“syntax_valid=true”不能代表“业务测试通过”。随后讨论如何增加真实单元测试工具，而不是修改提示词声称已经执行测试。</w:t>
+        <w:t xml:space="preserve">练习：将业务实现改成语法正确但始终返回空数组，验证外部业务验收失败；让候选只打印“Ran 5 tests”然后退出，验证零用例不会通过。使用宿主预先指定的工作区，模型不能改验收文件。</w:t>
       </w:r>
     </w:p>
     <w:p>
@@ -2326,159 +2326,87 @@
         <w:pStyle w:val="Heading1"/>
       </w:pPr>
       <w:r>
-        <w:t xml:space="preserve">7. 开发团队与人工审批</w:t>
-      </w:r>
-    </w:p>
-    <w:p>
-      <w:pPr>
-        <w:pStyle w:val="Normal"/>
-      </w:pPr>
-      <w:r>
-        <w:t xml:space="preserve">本版沿用产品经理、架构师、前端、后端、审查员和测试工程师六个角色。</w:t>
-      </w:r>
-    </w:p>
-    <w:p>
-      <w:pPr>
-        <w:pStyle w:val="Code"/>
-      </w:pPr>
-      <w:r>
-        <w:t xml:space="preserve">PM -&gt; Architect -&gt; Frontend -&gt; Backend -&gt; Reviewer -&gt; 人工审批 -&gt; Tester</w:t>
-      </w:r>
-    </w:p>
-    <w:p>
-      <w:pPr>
-        <w:pStyle w:val="Normal"/>
-      </w:pPr>
-      <w:r>
-        <w:t xml:space="preserve">前端与后端在本实验中顺序执行。不要把组织图中的并列角色误认为程序已经并行运行。</w:t>
-      </w:r>
-    </w:p>
-    <w:p>
-      <w:pPr>
-        <w:pStyle w:val="Heading2"/>
-      </w:pPr>
-      <w:r>
-        <w:t xml:space="preserve">7.1 先观察暂停</w:t>
-      </w:r>
-    </w:p>
-    <w:p>
-      <w:pPr>
-        <w:pStyle w:val="Code"/>
-      </w:pPr>
-      <w:r>
-        <w:t xml:space="preserve">node run.mjs --mode devteam</w:t>
-      </w:r>
-    </w:p>
-    <w:p>
-      <w:pPr>
-        <w:pStyle w:val="Normal"/>
-      </w:pPr>
-      <w:r>
-        <w:t xml:space="preserve">预期status为awaiting_approval，events中有reviewer和interrupt，没有tester，也不生成成功版devteam.md。</w:t>
-      </w:r>
-    </w:p>
-    <w:p>
-      <w:pPr>
-        <w:pStyle w:val="Normal"/>
-      </w:pPr>
-      <w:r>
-        <w:t xml:space="preserve">审核后显式允许测试角色：</w:t>
-      </w:r>
-    </w:p>
-    <w:p>
-      <w:pPr>
-        <w:pStyle w:val="Code"/>
-      </w:pPr>
-      <w:r>
-        <w:t xml:space="preserve">node run.mjs --mode devteam --approve</w:t>
-      </w:r>
-    </w:p>
-    <w:p>
-      <w:pPr>
-        <w:pStyle w:val="Normal"/>
-      </w:pPr>
-      <w:r>
-        <w:t xml:space="preserve">Node.js这个命令会重新执行整条流程；它是审批门槛演练，没有持久化检查点。若用于真实模式，重新执行前序角色会再次消耗模型额度。</w:t>
-      </w:r>
-    </w:p>
-    <w:p>
-      <w:pPr>
-        <w:pStyle w:val="Heading2"/>
-      </w:pPr>
-      <w:r>
-        <w:t xml:space="preserve">7.2 Python检查点恢复</w:t>
-      </w:r>
-    </w:p>
-    <w:p>
-      <w:pPr>
-        <w:pStyle w:val="Code"/>
-      </w:pPr>
-      <w:r>
-        <w:t xml:space="preserve">.\.venv\Scripts\python.exe .\python\labs.py --lab devteam --check</w:t>
-      </w:r>
-    </w:p>
-    <w:p>
-      <w:pPr>
-        <w:pStyle w:val="Code"/>
-      </w:pPr>
-      <w:r>
-        <w:t xml:space="preserve">.\.venv\Scripts\python.exe .\python\labs.py --lab devteam --topic "设计待办事项工具的教学方案"</w:t>
-      </w:r>
-    </w:p>
-    <w:p>
-      <w:pPr>
-        <w:pStyle w:val="Normal"/>
-      </w:pPr>
-      <w:r>
-        <w:t xml:space="preserve">reviewer被放在外层StateGraph中，interrupt_after=["reviewer"]指向真实存在的外层节点。运行后检查 pending_nodes，预期包含tester。</w:t>
-      </w:r>
-    </w:p>
-    <w:p>
-      <w:pPr>
-        <w:pStyle w:val="Normal"/>
-      </w:pPr>
-      <w:r>
-        <w:t xml:space="preserve">原材料将暂停放在Supervisor图上，是否生效取决于编译后的图中有没有同名节点。本版用显式外层节点保证暂停位置可检查。</w:t>
-      </w:r>
-    </w:p>
-    <w:p>
-      <w:pPr>
-        <w:pStyle w:val="Code"/>
-      </w:pPr>
-      <w:r>
-        <w:t xml:space="preserve">.\.venv\Scripts\python.exe .\python\labs.py --lab devteam --approve --topic "设计待办事项工具的教学方案"</w:t>
-      </w:r>
-    </w:p>
-    <w:p>
-      <w:pPr>
-        <w:pStyle w:val="Normal"/>
-      </w:pPr>
-      <w:r>
-        <w:t xml:space="preserve">这个命令在一次进程内先执行到reviewer，再带相同thread_id调用 invoke(None) 恢复tester。默认不自动恢复；调用者必须明确传入approve。</w:t>
-      </w:r>
-    </w:p>
-    <w:p>
-      <w:pPr>
-        <w:pStyle w:val="Normal"/>
-      </w:pPr>
-      <w:r>
-        <w:t xml:space="preserve">InMemorySaver只保存在当前进程内。先运行一次、不传approve，然后关闭进程，再另起命令，不会读取旧检查点。生产中的跨进程审批需要持久化存储、待审批任务ID和审批记录，本版没有实现这些。</w:t>
-      </w:r>
-    </w:p>
-    <w:p>
-      <w:pPr>
-        <w:pStyle w:val="Normal"/>
-      </w:pPr>
-      <w:r>
-        <w:t xml:space="preserve">提示词里写“最多重试3次”不是重试限制。原材料的MAX_RETRIES仅进入提示词；本版不宣称它已经成为执行层重试机制。若要实现审查失败后的自动返工，应增加显式计数状态和条件边，达到上限时以失败状态停止。</w:t>
-      </w:r>
-    </w:p>
-    <w:p>
-      <w:pPr>
-        <w:pStyle w:val="Normal"/>
-      </w:pPr>
-      <w:r>
-        <w:t xml:space="preserve">验收标准：审批前tester未运行；显式批准后tester运行；能说明内存检查点的生命周期，以及测试计划、语法检查和真实业务测试的区别。</w:t>
+        <w:t xml:space="preserve">7. 开发团队：新需求到多文件产品</w:t>
+      </w:r>
+    </w:p>
+    <w:p>
+      <w:pPr>
+        <w:pStyle w:val="Normal"/>
+      </w:pPr>
+      <w:r>
+        <w:t xml:space="preserve">Node和Python的devteam入口共用相邻agent-training目录的MetaGPT执行链路。角色依次消费需求、PRD、设计和实际源码。开发者生成app.py、领域模块、前端、README与requirements.lock；不再返回固定add_task示例。旧的六角色讨论只产生方案，不能作为产品交付。</w:t>
+      </w:r>
+    </w:p>
+    <w:p>
+      <w:pPr>
+        <w:pStyle w:val="Normal"/>
+      </w:pPr>
+      <w:r>
+        <w:t xml:space="preserve">准备agent-training/.venv-metagpt、Docker Linux、python:3.11-slim和Playwright Chromium后，在本目录运行：</w:t>
+      </w:r>
+    </w:p>
+    <w:p>
+      <w:pPr>
+        <w:pStyle w:val="Code"/>
+      </w:pPr>
+      <w:r>
+        <w:t xml:space="preserve">node run.mjs --mode devteam --requirements ../agent-training/demo/product_team/examples/inventory.json --output ./outputs/inventory</w:t>
+      </w:r>
+    </w:p>
+    <w:p>
+      <w:pPr>
+        <w:pStyle w:val="Code"/>
+      </w:pPr>
+      <w:r>
+        <w:t xml:space="preserve">.\.venv\Scripts\python.exe python/labs.py --lab devteam --requirements ../agent-training/demo/product_team/examples/booking.json --output ./outputs/booking</w:t>
+      </w:r>
+    </w:p>
+    <w:p>
+      <w:pPr>
+        <w:pStyle w:val="Normal"/>
+      </w:pPr>
+      <w:r>
+        <w:t xml:space="preserve">两个入口都使用共享模型网关；其他Python协作模式仍使用原LangGraph实现。可设置TRAINING_PRODUCT_PYTHON指定MetaGPT解释器。--check校验需求和容器环境，不调用模型。</w:t>
+      </w:r>
+    </w:p>
+    <w:p>
+      <w:pPr>
+        <w:pStyle w:val="Normal"/>
+      </w:pPr>
+      <w:r>
+        <w:t xml:space="preserve">评审返回pass/request_changes/needs_context，问题必须定位源码。验收在受限容器外断言实际HTTP响应，并用浏览器提交和刷新页面。失败会将当前版本意见交给开发者修复；修复后旧证据失效；轮次耗尽转needs_human。只有全部规定用例通过且评审通过才waiting_approval。</w:t>
+      </w:r>
+    </w:p>
+    <w:p>
+      <w:pPr>
+        <w:pStyle w:val="Normal"/>
+      </w:pPr>
+      <w:r>
+        <w:t xml:space="preserve">查看state.json中的review.revision，再在新进程明确作决定：</w:t>
+      </w:r>
+    </w:p>
+    <w:p>
+      <w:pPr>
+        <w:pStyle w:val="Code"/>
+      </w:pPr>
+      <w:r>
+        <w:t xml:space="preserve">node run.mjs --mode devteam --decision approve --run-dir ./outputs/inventory --revision &lt;实际版本摘要&gt;</w:t>
+      </w:r>
+    </w:p>
+    <w:p>
+      <w:pPr>
+        <w:pStyle w:val="Normal"/>
+      </w:pPr>
+      <w:r>
+        <w:t xml:space="preserve">--approve已移除，不能自动放行未来产物。批准会再次在干净容器验收，并生成独立交付ZIP。正式启动核对当前源码、需求、验收器、审批记录及快照；未批准、拒绝、过期、篡改均拒绝。恢复用--resume --output &lt;原运行目录&gt;，从持久化文档/源码继续评审验收，并非恢复任意框架内部指令位置。</w:t>
+      </w:r>
+    </w:p>
+    <w:p>
+      <w:pPr>
+        <w:pStyle w:val="Normal"/>
+      </w:pPr>
+      <w:r>
+        <w:t xml:space="preserve">完整的输入格式、状态、审批、运行命令和可信边界见 ../agent-training/docs/product-development-guide.md。本地示例角色令牌用于课堂验收；接入真实用户须增加实际认证。</w:t>
       </w:r>
     </w:p>
     <w:p>
@@ -3807,87 +3735,63 @@
         <w:pStyle w:val="Heading1"/>
       </w:pPr>
       <w:r>
-        <w:t xml:space="preserve">12. 综合练习：为一个业务任务选择协作方式</w:t>
-      </w:r>
-    </w:p>
-    <w:p>
-      <w:pPr>
-        <w:pStyle w:val="Normal"/>
-      </w:pPr>
-      <w:r>
-        <w:t xml:space="preserve">选择“客服知识库维护”或“企业培训报告编写”，使用本地资料完成一次演练：</w:t>
-      </w:r>
-    </w:p>
-    <w:p>
-      <w:pPr>
-        <w:pStyle w:val="Code"/>
-      </w:pPr>
-      <w:r>
-        <w:t xml:space="preserve">node run.mjs --mode supervisor --topic "企业培训报告的Agent协作方案" --output .\outputs\exercise</w:t>
-      </w:r>
-    </w:p>
-    <w:p>
-      <w:pPr>
-        <w:pStyle w:val="Normal"/>
-      </w:pPr>
-      <w:r>
-        <w:t xml:space="preserve">账号和网络就绪后，可以增加真实模型对照：</w:t>
-      </w:r>
-    </w:p>
-    <w:p>
-      <w:pPr>
-        <w:pStyle w:val="Code"/>
-      </w:pPr>
-      <w:r>
-        <w:t xml:space="preserve">node run.mjs --mode supervisor --topic "企业培训报告的Agent协作方案" --output .\outputs\exercise-live --live --max-calls 12</w:t>
-      </w:r>
-    </w:p>
-    <w:p>
-      <w:pPr>
-        <w:pStyle w:val="Normal"/>
-      </w:pPr>
-      <w:r>
-        <w:t xml:space="preserve">每位学员提交以下结果：</w:t>
-      </w:r>
-    </w:p>
-    <w:p>
-      <w:pPr>
-        <w:pStyle w:val="Normal"/>
-      </w:pPr>
-      <w:r>
-        <w:t xml:space="preserve">1. 输出JSON与报告Markdown，并注明是离线模拟还是真实模型。</w:t>
-      </w:r>
-    </w:p>
-    <w:p>
-      <w:pPr>
-        <w:pStyle w:val="Normal"/>
-      </w:pPr>
-      <w:r>
-        <w:t xml:space="preserve">2. 一段执行轨迹，指出调度者、Worker和工具的区别。</w:t>
-      </w:r>
-    </w:p>
-    <w:p>
-      <w:pPr>
-        <w:pStyle w:val="Normal"/>
-      </w:pPr>
-      <w:r>
-        <w:t xml:space="preserve">3. 选择这种模式的理由，以及使用更简单流水线是否足够。</w:t>
-      </w:r>
-    </w:p>
-    <w:p>
-      <w:pPr>
-        <w:pStyle w:val="Normal"/>
-      </w:pPr>
-      <w:r>
-        <w:t xml:space="preserve">4. 一次失败演练记录，说明超限、暂停与错误的差异。</w:t>
-      </w:r>
-    </w:p>
-    <w:p>
-      <w:pPr>
-        <w:pStyle w:val="Normal"/>
-      </w:pPr>
-      <w:r>
-        <w:t xml:space="preserve">5. 真实模型学员补充调用次数、Token记录、内容评审及事实核对。</w:t>
+        <w:t xml:space="preserve">12. 综合练习：交付两个不同领域产品</w:t>
+      </w:r>
+    </w:p>
+    <w:p>
+      <w:pPr>
+        <w:pStyle w:val="Normal"/>
+      </w:pPr>
+      <w:r>
+        <w:t xml:space="preserve">先完成库存与领用，再换成会议室预约，或者自行编写同等明确的新需求JSON。禁止修改编排代码或复制固定业务fixture来适配第二领域。核心规则未确认时保持unresolved非空，阻止生成。</w:t>
+      </w:r>
+    </w:p>
+    <w:p>
+      <w:pPr>
+        <w:pStyle w:val="Normal"/>
+      </w:pPr>
+      <w:r>
+        <w:t xml:space="preserve">每位学员提交：</w:t>
+      </w:r>
+    </w:p>
+    <w:p>
+      <w:pPr>
+        <w:pStyle w:val="Normal"/>
+      </w:pPr>
+      <w:r>
+        <w:t xml:space="preserve">1. 需求、需求到验收ID映射、PRD、设计与多文件源码；说明两个领域的模型和接口差异。</w:t>
+      </w:r>
+    </w:p>
+    <w:p>
+      <w:pPr>
+        <w:pStyle w:val="Normal"/>
+      </w:pPr>
+      <w:r>
+        <w:t xml:space="preserve">2. Docker镜像摘要、依赖锁定说明、完整执行轨迹、实际HTTP响应、业务测试及浏览器截图。</w:t>
+      </w:r>
+    </w:p>
+    <w:p>
+      <w:pPr>
+        <w:pStyle w:val="Normal"/>
+      </w:pPr>
+      <w:r>
+        <w:t xml:space="preserve">3. 至少一次评审退回、真实代码修复、当前版本复审和重新验收。</w:t>
+      </w:r>
+    </w:p>
+    <w:p>
+      <w:pPr>
+        <w:pStyle w:val="Normal"/>
+      </w:pPr>
+      <w:r>
+        <w:t xml:space="preserve">4. 针对实际版本的人工决定、独立交付ZIP、干净目录启动记录、数据备份与回滚说明。</w:t>
+      </w:r>
+    </w:p>
+    <w:p>
+      <w:pPr>
+        <w:pStyle w:val="Normal"/>
+      </w:pPr>
+      <w:r>
+        <w:t xml:space="preserve">5. 零测试伪造、非法输入、权限、重复请求、并发、重启、过期批准和篡改的失败证据。</w:t>
       </w:r>
     </w:p>
     <w:tbl>
@@ -3945,7 +3849,7 @@
               <w:pStyle w:val="TableText"/>
             </w:pPr>
             <w:r>
-              <w:t xml:space="preserve">能启动</w:t>
+              <w:t xml:space="preserve">需求驱动</w:t>
             </w:r>
           </w:p>
         </w:tc>
@@ -3958,7 +3862,7 @@
               <w:pStyle w:val="TableText"/>
             </w:pPr>
             <w:r>
-              <w:t xml:space="preserve">命令、环境与所用入口写清楚</w:t>
+              <w:t xml:space="preserve">第二领域不改编排器；领域模块、接口、前端和验收随需求变化</w:t>
             </w:r>
           </w:p>
         </w:tc>
@@ -3973,7 +3877,7 @@
               <w:pStyle w:val="TableText"/>
             </w:pPr>
             <w:r>
-              <w:t xml:space="preserve">能追踪</w:t>
+              <w:t xml:space="preserve">可运行</w:t>
             </w:r>
           </w:p>
         </w:tc>
@@ -3986,7 +3890,7 @@
               <w:pStyle w:val="TableText"/>
             </w:pPr>
             <w:r>
-              <w:t xml:space="preserve">找到每个角色和路由的记录</w:t>
+              <w:t xml:space="preserve">从空业务代码目录生成，候选只在受限容器执行</w:t>
             </w:r>
           </w:p>
         </w:tc>
@@ -4001,7 +3905,7 @@
               <w:pStyle w:val="TableText"/>
             </w:pPr>
             <w:r>
-              <w:t xml:space="preserve">能产出</w:t>
+              <w:t xml:space="preserve">业务正确</w:t>
             </w:r>
           </w:p>
         </w:tc>
@@ -4014,7 +3918,7 @@
               <w:pStyle w:val="TableText"/>
             </w:pPr>
             <w:r>
-              <w:t xml:space="preserve">状态与文件一致，来源可追溯</w:t>
+              <w:t xml:space="preserve">外部HTTP和浏览器验收实际执行且覆盖规则，零项用例拒绝</w:t>
             </w:r>
           </w:p>
         </w:tc>
@@ -4029,7 +3933,7 @@
               <w:pStyle w:val="TableText"/>
             </w:pPr>
             <w:r>
-              <w:t xml:space="preserve">能停止</w:t>
+              <w:t xml:space="preserve">失败返工</w:t>
             </w:r>
           </w:p>
         </w:tc>
@@ -4042,7 +3946,7 @@
               <w:pStyle w:val="TableText"/>
             </w:pPr>
             <w:r>
-              <w:t xml:space="preserve">循环实验能终止，审批前测试角色不运行</w:t>
+              <w:t xml:space="preserve">阻断评审和失败测试不得completed，修复后重新核对版本</w:t>
             </w:r>
           </w:p>
         </w:tc>
@@ -4057,7 +3961,7 @@
               <w:pStyle w:val="TableText"/>
             </w:pPr>
             <w:r>
-              <w:t xml:space="preserve">能解释</w:t>
+              <w:t xml:space="preserve">版本审批</w:t>
             </w:r>
           </w:p>
         </w:tc>
@@ -4070,7 +3974,63 @@
               <w:pStyle w:val="TableText"/>
             </w:pPr>
             <w:r>
-              <w:t xml:space="preserve">不把离线模拟、构图成功或语法检查误认为真实业务成功</w:t>
+              <w:t xml:space="preserve">只批准已完成版本，未批准或修改后不能正式启动</w:t>
+            </w:r>
+          </w:p>
+        </w:tc>
+      </w:tr>
+      <w:tr>
+        <w:tc>
+          <w:tcPr>
+            <w:tcW w:w="2500" w:type="pct"/>
+          </w:tcPr>
+          <w:p>
+            <w:pPr>
+              <w:pStyle w:val="TableText"/>
+            </w:pPr>
+            <w:r>
+              <w:t xml:space="preserve">可交付</w:t>
+            </w:r>
+          </w:p>
+        </w:tc>
+        <w:tc>
+          <w:tcPr>
+            <w:tcW w:w="2500" w:type="pct"/>
+          </w:tcPr>
+          <w:p>
+            <w:pPr>
+              <w:pStyle w:val="TableText"/>
+            </w:pPr>
+            <w:r>
+              <w:t xml:space="preserve">ZIP在无原项目代码的新目录运行，依赖和镜像可复现</w:t>
+            </w:r>
+          </w:p>
+        </w:tc>
+      </w:tr>
+      <w:tr>
+        <w:tc>
+          <w:tcPr>
+            <w:tcW w:w="2500" w:type="pct"/>
+          </w:tcPr>
+          <w:p>
+            <w:pPr>
+              <w:pStyle w:val="TableText"/>
+            </w:pPr>
+            <w:r>
+              <w:t xml:space="preserve">证据诚实</w:t>
+            </w:r>
+          </w:p>
+        </w:tc>
+        <w:tc>
+          <w:tcPr>
+            <w:tcW w:w="2500" w:type="pct"/>
+          </w:tcPr>
+          <w:p>
+            <w:pPr>
+              <w:pStyle w:val="TableText"/>
+            </w:pPr>
+            <w:r>
+              <w:t xml:space="preserve">离线替身、真实模型、接口验收与交付测试分别记录</w:t>
             </w:r>
           </w:p>
         </w:tc>
@@ -4081,7 +4041,7 @@
         <w:pStyle w:val="Normal"/>
       </w:pPr>
       <w:r>
-        <w:t xml:space="preserve">模型输出没有天然正确性。验收应包含任务是否完成、来源是否可信、角色是否重复、费用是否合理，而不是只看“有一份报告”。</w:t>
+        <w:t xml:space="preserve">模型质量以本次结果为准；生成失败、基础设施超时与测试失败都要留证，不能以“有报告”或“角色执行完”代替交付。</w:t>
       </w:r>
     </w:p>
     <w:p>

</xml_diff>